<commit_message>
Retrait du kit feu vert DSI : pile, FAQ, carte des heures perdues et documents
Co-Authored-By: Claude Opus 5.5 <noreply@anthropic.com>
Claude-Session: https://claude.ai/code/session_01LC4TupPrFso4836h2aRcwR
</commit_message>
<xml_diff>
--- a/rapports/2026-10-12_concurrents-faq-avis.docx
+++ b/rapports/2026-10-12_concurrents-faq-avis.docx
@@ -2832,7 +2832,7 @@
                 <w:b w:val="0"/>
                 <w:sz w:val="20"/>
               </w:rPr>
-              <w:t>Oui pour quatre des cinq bonus. « Trois mois de suivi Signature » porte un nom de formule sans bénéfice</w:t>
+              <w:t>Oui pour trois des quatre bonus. « Trois mois de suivi Signature » porte un nom de formule sans bénéfice</w:t>
             </w:r>
           </w:p>
         </w:tc>
@@ -3032,7 +3032,7 @@
                 <w:b w:val="0"/>
                 <w:sz w:val="20"/>
               </w:rPr>
-              <w:t>Fait : deux tableurs, une charte, une fiche, un prompt, deux trames</w:t>
+              <w:t>Fait : deux tableurs, un prompt, deux trames de visio et le programme du suivi</w:t>
             </w:r>
           </w:p>
         </w:tc>
@@ -3112,7 +3112,7 @@
                 <w:b w:val="0"/>
                 <w:sz w:val="20"/>
               </w:rPr>
-              <w:t>Respectée depuis le 12 octobre 2026 : l’outil par personne passe en bonus, le prompt qui écrit vos prompts passe dans l’offre de base et le compteur sort de la pile. Bonus 9 900 € (700 + 7 000 + 700 + 600 + 900) pour une offre de base à 3 950 € (3 500 + 450)</w:t>
+              <w:t>Respectée depuis le 12 octobre 2026 : l’outil par personne passe en bonus, le prompt qui écrit vos prompts passe dans l’offre de base, le compteur et le kit DSI sortent de la pile. Bonus 9 200 € (700 + 7 000 + 600 + 900) pour une offre de base à 3 950 € (3 500 + 450)</w:t>
             </w:r>
           </w:p>
         </w:tc>

</xml_diff>

<commit_message>
Nom de l'offre : Accélérateur IA 30 jours
Co-Authored-By: Claude Opus 5.5 <noreply@anthropic.com>
Claude-Session: https://claude.ai/code/session_01LC4TupPrFso4836h2aRcwR
</commit_message>
<xml_diff>
--- a/rapports/2026-10-12_concurrents-faq-avis.docx
+++ b/rapports/2026-10-12_concurrents-faq-avis.docx
@@ -1462,7 +1462,7 @@
                 <w:color w:val="FFFFFF"/>
                 <w:sz w:val="20"/>
               </w:rPr>
-              <w:t>Ce que le Sprint y oppose</w:t>
+              <w:t>Ce que l’Accélérateur y oppose</w:t>
             </w:r>
           </w:p>
         </w:tc>
@@ -2232,7 +2232,7 @@
         <w:rPr>
           <w:b w:val="0"/>
         </w:rPr>
-        <w:t>À 4 900 € HT, le Sprint coûte plus cher qu’une journée intra de catalogue. Hormozi traite ce cas par le bundle : il règle tous les problèmes perçus et rend la comparaison impossible (Offers, ch. 10 Trim &amp; Stack, p. 117). La page applique ce principe avec le comparatif en neuf lignes et la pile chiffrée. Elle n’affiche aucun prix concurrent.</w:t>
+        <w:t>À 4 900 € HT, l’Accélérateur coûte plus cher qu’une journée intra de catalogue. Hormozi traite ce cas par le bundle : il règle tous les problèmes perçus et rend la comparaison impossible (Offers, ch. 10 Trim &amp; Stack, p. 117). La page applique ce principe avec le comparatif en neuf lignes et la pile chiffrée. Elle n’affiche aucun prix concurrent.</w:t>
       </w:r>
     </w:p>
     <w:p>
@@ -2440,17 +2440,10 @@
             </w:r>
             <w:r>
               <w:rPr>
-                <w:b/>
-                <w:sz w:val="20"/>
-              </w:rPr>
-              <w:t>Sprint de l’heure gagnée</w:t>
-            </w:r>
-            <w:r>
-              <w:rPr>
                 <w:b w:val="0"/>
                 <w:sz w:val="20"/>
               </w:rPr>
-              <w:t xml:space="preserve"> (appliqué)</w:t>
+              <w:t>Sprint de l’heure gagnée (écarté par Antoine)</w:t>
             </w:r>
           </w:p>
         </w:tc>
@@ -2678,6 +2671,20 @@
           <w:b w:val="0"/>
         </w:rPr>
         <w:t>Pour les publicités Meta : la plupart des plateformes refusent une promesse chiffrée assortie d’un délai (Offers, ch. 16 Naming, p. 175-176). Le nom court passe. La forme longue avec « 30 jours » reste sur la page. Hormozi conseille de tester deux ou trois noms en publicité et de garder le gagnant comme contrôle (p. 178).</w:t>
+      </w:r>
+    </w:p>
+    <w:p>
+      <w:r>
+        <w:rPr>
+          <w:b/>
+        </w:rPr>
+        <w:t>Nom retenu le 12 octobre 2026 : Accélérateur IA 30 jours.</w:t>
+      </w:r>
+      <w:r>
+        <w:rPr>
+          <w:b w:val="0"/>
+        </w:rPr>
+        <w:t xml:space="preserve"> Container « Accelerator » et Interval « 30 jours », sur le modèle « 7F Agency 12 Week Intensive » (Offers, ch. 16 Naming, p. 175 et p. 177-178). La durée sans promesse chiffrée passe en publicité (p. 175-176).</w:t>
       </w:r>
     </w:p>
     <w:p>

</xml_diff>

<commit_message>
Haut de page : texte corrigé avec les règles d'écriture, boucle vidéo remplacée par la preuve des 10 h
Rapport concurrents : total des bonus corrigé à 9 700 €.

Co-Authored-By: Claude Opus 5.5 <noreply@anthropic.com>
Claude-Session: https://claude.ai/code/session_01LC4TupPrFso4836h2aRcwR
</commit_message>
<xml_diff>
--- a/rapports/2026-10-12_concurrents-faq-avis.docx
+++ b/rapports/2026-10-12_concurrents-faq-avis.docx
@@ -1698,7 +1698,7 @@
                 <w:b w:val="0"/>
                 <w:sz w:val="20"/>
               </w:rPr>
-              <w:t>Deux visios de déblocage, compteur, contrôle à 30 jours</w:t>
+              <w:t>Deux visios de déblocage, mesure du temps gagné à 30 jours</w:t>
             </w:r>
           </w:p>
         </w:tc>
@@ -2839,7 +2839,7 @@
                 <w:b w:val="0"/>
                 <w:sz w:val="20"/>
               </w:rPr>
-              <w:t>Oui pour trois des quatre bonus. « Trois mois de suivi Signature » porte un nom de formule sans bénéfice</w:t>
+              <w:t>Partiel : les trois agents portent un prénom et leur domaine, « Carte des heures perdues » et « Deux visios de déblocage » portent un bénéfice, « Trois mois de suivi Signature » porte un nom de formule sans bénéfice</w:t>
             </w:r>
           </w:p>
         </w:tc>
@@ -3039,7 +3039,7 @@
                 <w:b w:val="0"/>
                 <w:sz w:val="20"/>
               </w:rPr>
-              <w:t>Fait : deux tableurs, un prompt, deux trames de visio et le programme du suivi</w:t>
+              <w:t>Fait : un tableur, trois agents IA, deux trames de visio et le programme du suivi</w:t>
             </w:r>
           </w:p>
         </w:tc>
@@ -3119,7 +3119,7 @@
                 <w:b w:val="0"/>
                 <w:sz w:val="20"/>
               </w:rPr>
-              <w:t>Respectée depuis le 12 octobre 2026 : l’outil par personne passe en bonus, le prompt qui écrit vos prompts passe dans l’offre de base, le compteur et le kit DSI sortent de la pile. Bonus 9 200 € (700 + 7 000 + 600 + 900) pour une offre de base à 3 950 € (3 500 + 450)</w:t>
+              <w:t>Respectée : bonus 9 700 € (3 000 + 3 000 + 1 500 + 700 + 600 + 900) pour une offre de base à 4 900 € (3 500 + 1 400). Les trois agents IA entrent dans les bonus. Le compteur et le kit DSI sortent de la pile ; l’outil de chaque personne reste dans la journée</w:t>
             </w:r>
           </w:p>
         </w:tc>

</xml_diff>